<commit_message>
Première mise à jour énoncés d'exercices
</commit_message>
<xml_diff>
--- a/_demos/Demo_ABS.docx
+++ b/_demos/Demo_ABS.docx
@@ -4,7 +4,48 @@
   <w:body>
     <w:p>
       <w:pPr>
-        <w:spacing w:after="100" w:before="1000"/>
+        <w:spacing w:after="0"/>
+      </w:pPr>
+      <w:r>
+        <w:drawing>
+          <wp:inline distT="0" distB="0" distL="0" distR="0">
+            <wp:extent cx="1514475" cy="723900"/>
+            <wp:docPr id="9901" name="logo_ephec" descr="Logo de l'EPHEC" title="EPHEC"/>
+            <wp:cNvGraphicFramePr>
+              <a:graphicFrameLocks xmlns:a="http://schemas.openxmlformats.org/drawingml/2006/main" noChangeAspect="1"/>
+            </wp:cNvGraphicFramePr>
+            <a:graphic xmlns:a="http://schemas.openxmlformats.org/drawingml/2006/main">
+              <a:graphicData uri="http://schemas.openxmlformats.org/drawingml/2006/picture">
+                <pic:pic xmlns:pic="http://schemas.openxmlformats.org/drawingml/2006/picture">
+                  <pic:nvPicPr>
+                    <pic:cNvPr id="9901" name="logo_ephec.png"/>
+                    <pic:cNvPicPr/>
+                  </pic:nvPicPr>
+                  <pic:blipFill>
+                    <a:blip xmlns:r="http://schemas.openxmlformats.org/officeDocument/2006/relationships" r:embed="rIdLogoEphec"/>
+                    <a:stretch>
+                      <a:fillRect/>
+                    </a:stretch>
+                  </pic:blipFill>
+                  <pic:spPr>
+                    <a:xfrm>
+                      <a:off x="0" y="0"/>
+                      <a:ext cx="1514475" cy="723900"/>
+                    </a:xfrm>
+                    <a:prstGeom prst="rect">
+                      <a:avLst/>
+                    </a:prstGeom>
+                  </pic:spPr>
+                </pic:pic>
+              </a:graphicData>
+            </a:graphic>
+          </wp:inline>
+        </w:drawing>
+      </w:r>
+    </w:p>
+    <w:p>
+      <w:pPr>
+        <w:spacing w:after="100" w:before="500"/>
         <w:jc w:val="center"/>
       </w:pPr>
       <w:r>
@@ -367,7 +408,23 @@
                 <w:sz w:val="22"/>
                 <w:szCs w:val="22"/>
               </w:rPr>
-              <w:t xml:space="preserve">regardez envoyer(). C'est le même code trois fois, à un mot près. Corrigez un jour le refus des messages vides, et vous aurez deux endroits où l'oublier.</w:t>
+              <w:t xml:space="preserve">regardez </w:t>
+            </w:r>
+            <w:r>
+              <w:rPr>
+                <w:rFonts w:ascii="Consolas" w:hAnsi="Consolas" w:cs="Consolas"/>
+                <w:color w:val="E97132" w:themeColor="accent2"/>
+                <w:sz w:val="18"/>
+                <w:szCs w:val="18"/>
+              </w:rPr>
+              <w:t xml:space="preserve">envoyer()</w:t>
+            </w:r>
+            <w:r>
+              <w:rPr>
+                <w:sz w:val="22"/>
+                <w:szCs w:val="22"/>
+              </w:rPr>
+              <w:t xml:space="preserve">. C'est le même code trois fois, à un mot près. Corrigez un jour le refus des messages vides, et vous aurez deux endroits où l'oublier.</w:t>
             </w:r>
           </w:p>
         </w:tc>
@@ -520,10 +577,10 @@
       </w:r>
       <w:r>
         <w:rPr>
-          <w:rFonts w:ascii="Consolas" w:cs="Consolas" w:eastAsia="Consolas" w:hAnsi="Consolas"/>
-          <w:color w:val="8B2500"/>
-          <w:sz w:val="22"/>
-          <w:szCs w:val="22"/>
+          <w:rFonts w:ascii="Consolas" w:hAnsi="Consolas" w:cs="Consolas"/>
+          <w:color w:val="E97132" w:themeColor="accent2"/>
+          <w:sz w:val="18"/>
+          <w:szCs w:val="18"/>
         </w:rPr>
         <w:t xml:space="preserve">NotificationMail</w:t>
       </w:r>
@@ -536,10 +593,10 @@
       </w:r>
       <w:r>
         <w:rPr>
-          <w:rFonts w:ascii="Consolas" w:cs="Consolas" w:eastAsia="Consolas" w:hAnsi="Consolas"/>
-          <w:color w:val="8B2500"/>
-          <w:sz w:val="22"/>
-          <w:szCs w:val="22"/>
+          <w:rFonts w:ascii="Consolas" w:hAnsi="Consolas" w:cs="Consolas"/>
+          <w:color w:val="E97132" w:themeColor="accent2"/>
+          <w:sz w:val="18"/>
+          <w:szCs w:val="18"/>
         </w:rPr>
         <w:t xml:space="preserve">Refactor → Extract → Superclass</w:t>
       </w:r>
@@ -552,10 +609,10 @@
       </w:r>
       <w:r>
         <w:rPr>
-          <w:rFonts w:ascii="Consolas" w:cs="Consolas" w:eastAsia="Consolas" w:hAnsi="Consolas"/>
-          <w:color w:val="8B2500"/>
-          <w:sz w:val="22"/>
-          <w:szCs w:val="22"/>
+          <w:rFonts w:ascii="Consolas" w:hAnsi="Consolas" w:cs="Consolas"/>
+          <w:color w:val="E97132" w:themeColor="accent2"/>
+          <w:sz w:val="18"/>
+          <w:szCs w:val="18"/>
         </w:rPr>
         <w:t xml:space="preserve">Notification</w:t>
       </w:r>
@@ -568,10 +625,10 @@
       </w:r>
       <w:r>
         <w:rPr>
-          <w:rFonts w:ascii="Consolas" w:cs="Consolas" w:eastAsia="Consolas" w:hAnsi="Consolas"/>
-          <w:color w:val="8B2500"/>
-          <w:sz w:val="22"/>
-          <w:szCs w:val="22"/>
+          <w:rFonts w:ascii="Consolas" w:hAnsi="Consolas" w:cs="Consolas"/>
+          <w:color w:val="E97132" w:themeColor="accent2"/>
+          <w:sz w:val="18"/>
+          <w:szCs w:val="18"/>
         </w:rPr>
         <w:t xml:space="preserve">envoyer</w:t>
       </w:r>
@@ -596,10 +653,10 @@
       </w:r>
       <w:r>
         <w:rPr>
-          <w:rFonts w:ascii="Consolas" w:cs="Consolas" w:eastAsia="Consolas" w:hAnsi="Consolas"/>
-          <w:color w:val="8B2500"/>
-          <w:sz w:val="22"/>
-          <w:szCs w:val="22"/>
+          <w:rFonts w:ascii="Consolas" w:hAnsi="Consolas" w:cs="Consolas"/>
+          <w:color w:val="E97132" w:themeColor="accent2"/>
+          <w:sz w:val="18"/>
+          <w:szCs w:val="18"/>
         </w:rPr>
         <w:t xml:space="preserve">Refactor → Pull Members Up</w:t>
       </w:r>
@@ -612,10 +669,10 @@
       </w:r>
       <w:r>
         <w:rPr>
-          <w:rFonts w:ascii="Consolas" w:cs="Consolas" w:eastAsia="Consolas" w:hAnsi="Consolas"/>
-          <w:color w:val="8B2500"/>
-          <w:sz w:val="22"/>
-          <w:szCs w:val="22"/>
+          <w:rFonts w:ascii="Consolas" w:hAnsi="Consolas" w:cs="Consolas"/>
+          <w:color w:val="E97132" w:themeColor="accent2"/>
+          <w:sz w:val="18"/>
+          <w:szCs w:val="18"/>
         </w:rPr>
         <w:t xml:space="preserve">Notification</w:t>
       </w:r>
@@ -728,10 +785,10 @@
       </w:r>
       <w:r>
         <w:rPr>
-          <w:rFonts w:ascii="Consolas" w:cs="Consolas" w:eastAsia="Consolas" w:hAnsi="Consolas"/>
-          <w:color w:val="8B2500"/>
-          <w:sz w:val="22"/>
-          <w:szCs w:val="22"/>
+          <w:rFonts w:ascii="Consolas" w:hAnsi="Consolas" w:cs="Consolas"/>
+          <w:color w:val="E97132" w:themeColor="accent2"/>
+          <w:sz w:val="18"/>
+          <w:szCs w:val="18"/>
         </w:rPr>
         <w:t xml:space="preserve">protected abstract String canal();</w:t>
       </w:r>
@@ -790,10 +847,10 @@
       </w:r>
       <w:r>
         <w:rPr>
-          <w:rFonts w:ascii="Consolas" w:cs="Consolas" w:eastAsia="Consolas" w:hAnsi="Consolas"/>
-          <w:color w:val="8B2500"/>
-          <w:sz w:val="22"/>
-          <w:szCs w:val="22"/>
+          <w:rFonts w:ascii="Consolas" w:hAnsi="Consolas" w:cs="Consolas"/>
+          <w:color w:val="E97132" w:themeColor="accent2"/>
+          <w:sz w:val="18"/>
+          <w:szCs w:val="18"/>
         </w:rPr>
         <w:t xml:space="preserve">envoyer()</w:t>
       </w:r>
@@ -853,7 +910,23 @@
                 <w:sz w:val="22"/>
                 <w:szCs w:val="22"/>
               </w:rPr>
-              <w:t xml:space="preserve">aucun instanceof, aucun test de type. Ajouter Slack demanderait une classe et un élément de plus dans ce tableau, rien d'autre.</w:t>
+              <w:t xml:space="preserve">aucun </w:t>
+            </w:r>
+            <w:r>
+              <w:rPr>
+                <w:rFonts w:ascii="Consolas" w:hAnsi="Consolas" w:cs="Consolas"/>
+                <w:color w:val="E97132" w:themeColor="accent2"/>
+                <w:sz w:val="18"/>
+                <w:szCs w:val="18"/>
+              </w:rPr>
+              <w:t xml:space="preserve">instanceof</w:t>
+            </w:r>
+            <w:r>
+              <w:rPr>
+                <w:sz w:val="22"/>
+                <w:szCs w:val="22"/>
+              </w:rPr>
+              <w:t xml:space="preserve">, aucun test de type. Ajouter Slack demanderait une classe et un élément de plus dans ce tableau, rien d'autre.</w:t>
             </w:r>
           </w:p>
         </w:tc>
@@ -928,47 +1001,79 @@
             </w:r>
             <w:r>
               <w:rPr>
-                <w:rFonts w:ascii="Consolas" w:cs="Consolas" w:eastAsia="Consolas" w:hAnsi="Consolas"/>
-                <w:color w:val="8B2500"/>
+                <w:rFonts w:ascii="Consolas" w:hAnsi="Consolas" w:cs="Consolas"/>
+                <w:color w:val="E97132" w:themeColor="accent2"/>
+                <w:sz w:val="18"/>
+                <w:szCs w:val="18"/>
+              </w:rPr>
+              <w:t xml:space="preserve">Notification</w:t>
+            </w:r>
+            <w:r>
+              <w:rPr>
                 <w:sz w:val="22"/>
                 <w:szCs w:val="22"/>
               </w:rPr>
-              <w:t xml:space="preserve">Notification</w:t>
+              <w:t xml:space="preserve"> abstraite, et écrire </w:t>
+            </w:r>
+            <w:r>
+              <w:rPr>
+                <w:rFonts w:ascii="Consolas" w:hAnsi="Consolas" w:cs="Consolas"/>
+                <w:color w:val="E97132" w:themeColor="accent2"/>
+                <w:sz w:val="18"/>
+                <w:szCs w:val="18"/>
+              </w:rPr>
+              <w:t xml:space="preserve">new Notification("x")</w:t>
             </w:r>
             <w:r>
               <w:rPr>
                 <w:sz w:val="22"/>
                 <w:szCs w:val="22"/>
               </w:rPr>
-              <w:t xml:space="preserve"> abstraite, et écrire </w:t>
-            </w:r>
-            <w:r>
-              <w:rPr>
-                <w:rFonts w:ascii="Consolas" w:cs="Consolas" w:eastAsia="Consolas" w:hAnsi="Consolas"/>
-                <w:color w:val="8B2500"/>
+              <w:t xml:space="preserve"> dans le main.</w:t>
+            </w:r>
+          </w:p>
+          <w:p>
+            <w:pPr>
+              <w:spacing w:after="80"/>
+            </w:pPr>
+            <w:r>
+              <w:rPr>
                 <w:sz w:val="22"/>
                 <w:szCs w:val="22"/>
               </w:rPr>
-              <w:t xml:space="preserve">new Notification("x")</w:t>
+              <w:t xml:space="preserve">Ça compile, et la notification n'a pas de canal : la méthode rend </w:t>
+            </w:r>
+            <w:r>
+              <w:rPr>
+                <w:rFonts w:ascii="Consolas" w:hAnsi="Consolas" w:cs="Consolas"/>
+                <w:color w:val="E97132" w:themeColor="accent2"/>
+                <w:sz w:val="18"/>
+                <w:szCs w:val="18"/>
+              </w:rPr>
+              <w:t xml:space="preserve">null</w:t>
             </w:r>
             <w:r>
               <w:rPr>
                 <w:sz w:val="22"/>
                 <w:szCs w:val="22"/>
               </w:rPr>
-              <w:t xml:space="preserve"> dans le main.</w:t>
-            </w:r>
-          </w:p>
-          <w:p>
-            <w:pPr>
-              <w:spacing w:after="80"/>
-            </w:pPr>
+              <w:t xml:space="preserve">, et le message affiche « Envoi d'un </w:t>
+            </w:r>
+            <w:r>
+              <w:rPr>
+                <w:rFonts w:ascii="Consolas" w:hAnsi="Consolas" w:cs="Consolas"/>
+                <w:color w:val="E97132" w:themeColor="accent2"/>
+                <w:sz w:val="18"/>
+                <w:szCs w:val="18"/>
+              </w:rPr>
+              <w:t xml:space="preserve">null</w:t>
+            </w:r>
             <w:r>
               <w:rPr>
                 <w:sz w:val="22"/>
                 <w:szCs w:val="22"/>
               </w:rPr>
-              <w:t xml:space="preserve">Ça compile, et la notification n'a pas de canal : la méthode rend null, et le message affiche « Envoi d'un null ».</w:t>
+              <w:t xml:space="preserve"> ».</w:t>
             </w:r>
           </w:p>
           <w:p>
@@ -986,10 +1091,19 @@
             </w:r>
             <w:r>
               <w:rPr>
+                <w:rFonts w:ascii="Consolas" w:hAnsi="Consolas" w:cs="Consolas"/>
+                <w:color w:val="E97132" w:themeColor="accent2"/>
+                <w:sz w:val="18"/>
+                <w:szCs w:val="18"/>
+              </w:rPr>
+              <w:t xml:space="preserve">abstract</w:t>
+            </w:r>
+            <w:r>
+              <w:rPr>
                 <w:sz w:val="22"/>
                 <w:szCs w:val="22"/>
               </w:rPr>
-              <w:t xml:space="preserve">abstract n'est pas une décoration. C'est ce qui interdit de construire une notification qui n'est rien en particulier.</w:t>
+              <w:t xml:space="preserve"> n'est pas une décoration. C'est ce qui interdit de construire une notification qui n'est rien en particulier.</w:t>
             </w:r>
           </w:p>
         </w:tc>
@@ -1105,7 +1219,8 @@
             </w:pPr>
             <w:r>
               <w:rPr>
-                <w:rFonts w:ascii="Consolas" w:cs="Consolas" w:eastAsia="Consolas" w:hAnsi="Consolas"/>
+                <w:rFonts w:ascii="Consolas" w:hAnsi="Consolas" w:cs="Consolas"/>
+                <w:color w:val="E97132" w:themeColor="accent2"/>
                 <w:sz w:val="18"/>
                 <w:szCs w:val="18"/>
               </w:rPr>
@@ -1157,7 +1272,8 @@
             </w:pPr>
             <w:r>
               <w:rPr>
-                <w:rFonts w:ascii="Consolas" w:cs="Consolas" w:eastAsia="Consolas" w:hAnsi="Consolas"/>
+                <w:rFonts w:ascii="Consolas" w:hAnsi="Consolas" w:cs="Consolas"/>
+                <w:color w:val="E97132" w:themeColor="accent2"/>
                 <w:sz w:val="18"/>
                 <w:szCs w:val="18"/>
               </w:rPr>
@@ -1209,7 +1325,8 @@
             </w:pPr>
             <w:r>
               <w:rPr>
-                <w:rFonts w:ascii="Consolas" w:cs="Consolas" w:eastAsia="Consolas" w:hAnsi="Consolas"/>
+                <w:rFonts w:ascii="Consolas" w:hAnsi="Consolas" w:cs="Consolas"/>
+                <w:color w:val="E97132" w:themeColor="accent2"/>
                 <w:sz w:val="18"/>
                 <w:szCs w:val="18"/>
               </w:rPr>
@@ -1272,10 +1389,10 @@
       </w:r>
       <w:r>
         <w:rPr>
-          <w:rFonts w:ascii="Consolas" w:cs="Consolas" w:eastAsia="Consolas" w:hAnsi="Consolas"/>
-          <w:color w:val="8B2500"/>
-          <w:sz w:val="22"/>
-          <w:szCs w:val="22"/>
+          <w:rFonts w:ascii="Consolas" w:hAnsi="Consolas" w:cs="Consolas"/>
+          <w:color w:val="E97132" w:themeColor="accent2"/>
+          <w:sz w:val="18"/>
+          <w:szCs w:val="18"/>
         </w:rPr>
         <w:t xml:space="preserve">python3 _outils/preparer_demo.py abs</w:t>
       </w:r>
@@ -1554,7 +1671,13 @@
 <file path=word/styles.xml><?xml version="1.0" encoding="utf-8"?>
 <w:styles xmlns:mc="http://schemas.openxmlformats.org/markup-compatibility/2006" xmlns:r="http://schemas.openxmlformats.org/officeDocument/2006/relationships" xmlns:w="http://schemas.openxmlformats.org/wordprocessingml/2006/main" xmlns:w14="http://schemas.microsoft.com/office/word/2010/wordml" xmlns:w15="http://schemas.microsoft.com/office/word/2012/wordml" mc:Ignorable="w14 w15">
   <w:docDefaults>
-    <w:rPrDefault/>
+    <w:rPrDefault>
+      <w:rPr>
+        <w:rFonts w:ascii="Cormorant Garamond" w:hAnsi="Cormorant Garamond" w:eastAsia="Cormorant Garamond" w:cs="Cormorant Garamond"/>
+        <w:sz w:val="22"/>
+        <w:szCs w:val="22"/>
+      </w:rPr>
+    </w:rPrDefault>
     <w:pPrDefault/>
   </w:docDefaults>
   <w:style w:type="paragraph" w:styleId="Title">
@@ -1563,6 +1686,7 @@
     <w:next w:val="Normal"/>
     <w:qFormat/>
     <w:rPr>
+      <w:rFonts w:ascii="Cormorant Garamond" w:hAnsi="Cormorant Garamond" w:eastAsia="Cormorant Garamond" w:cs="Cormorant Garamond"/>
       <w:sz w:val="56"/>
       <w:szCs w:val="56"/>
     </w:rPr>
@@ -1573,6 +1697,7 @@
     <w:next w:val="Normal"/>
     <w:qFormat/>
     <w:rPr>
+      <w:rFonts w:ascii="Cormorant Garamond" w:hAnsi="Cormorant Garamond" w:eastAsia="Cormorant Garamond" w:cs="Cormorant Garamond"/>
       <w:color w:val="2E74B5"/>
       <w:sz w:val="32"/>
       <w:szCs w:val="32"/>
@@ -1584,6 +1709,7 @@
     <w:next w:val="Normal"/>
     <w:qFormat/>
     <w:rPr>
+      <w:rFonts w:ascii="Cormorant Garamond" w:hAnsi="Cormorant Garamond" w:eastAsia="Cormorant Garamond" w:cs="Cormorant Garamond"/>
       <w:color w:val="2E74B5"/>
       <w:sz w:val="26"/>
       <w:szCs w:val="26"/>
@@ -1595,6 +1721,7 @@
     <w:next w:val="Normal"/>
     <w:qFormat/>
     <w:rPr>
+      <w:rFonts w:ascii="Cormorant Garamond" w:hAnsi="Cormorant Garamond" w:eastAsia="Cormorant Garamond" w:cs="Cormorant Garamond"/>
       <w:color w:val="1F4D78"/>
       <w:sz w:val="24"/>
       <w:szCs w:val="24"/>
@@ -1606,6 +1733,7 @@
     <w:next w:val="Normal"/>
     <w:qFormat/>
     <w:rPr>
+      <w:rFonts w:ascii="Cormorant Garamond" w:hAnsi="Cormorant Garamond" w:eastAsia="Cormorant Garamond" w:cs="Cormorant Garamond"/>
       <w:i/>
       <w:iCs/>
       <w:color w:val="2E74B5"/>
@@ -1617,6 +1745,7 @@
     <w:next w:val="Normal"/>
     <w:qFormat/>
     <w:rPr>
+      <w:rFonts w:ascii="Cormorant Garamond" w:hAnsi="Cormorant Garamond" w:eastAsia="Cormorant Garamond" w:cs="Cormorant Garamond"/>
       <w:color w:val="2E74B5"/>
     </w:rPr>
   </w:style>
@@ -1626,6 +1755,7 @@
     <w:next w:val="Normal"/>
     <w:qFormat/>
     <w:rPr>
+      <w:rFonts w:ascii="Cormorant Garamond" w:hAnsi="Cormorant Garamond" w:eastAsia="Cormorant Garamond" w:cs="Cormorant Garamond"/>
       <w:color w:val="1F4D78"/>
     </w:rPr>
   </w:style>

</xml_diff>

<commit_message>
Mise à jour des pages de garde des documents
</commit_message>
<xml_diff>
--- a/_demos/Demo_ABS.docx
+++ b/_demos/Demo_ABS.docx
@@ -4,13 +4,16 @@
   <w:body>
     <w:p>
       <w:pPr>
-        <w:spacing w:after="0"/>
+        <w:tabs>
+          <w:tab w:val="right" w:pos="9026"/>
+        </w:tabs>
       </w:pPr>
       <w:r>
         <w:drawing>
           <wp:inline distT="0" distB="0" distL="0" distR="0">
             <wp:extent cx="1514475" cy="723900"/>
-            <wp:docPr id="9901" name="logo_ephec" descr="Logo de l'EPHEC" title="EPHEC"/>
+            <wp:effectExtent t="0" r="0" b="0" l="0"/>
+            <wp:docPr id="1" name="logo" descr="Logo de l'EPHEC" title="EPHEC"/>
             <wp:cNvGraphicFramePr>
               <a:graphicFrameLocks xmlns:a="http://schemas.openxmlformats.org/drawingml/2006/main" noChangeAspect="1"/>
             </wp:cNvGraphicFramePr>
@@ -18,16 +21,19 @@
               <a:graphicData uri="http://schemas.openxmlformats.org/drawingml/2006/picture">
                 <pic:pic xmlns:pic="http://schemas.openxmlformats.org/drawingml/2006/picture">
                   <pic:nvPicPr>
-                    <pic:cNvPr id="9901" name="logo_ephec.png"/>
-                    <pic:cNvPicPr/>
+                    <pic:cNvPr id="0" name="" descr=""/>
+                    <pic:cNvPicPr>
+                      <a:picLocks noChangeAspect="1" noChangeArrowheads="1"/>
+                    </pic:cNvPicPr>
                   </pic:nvPicPr>
                   <pic:blipFill>
-                    <a:blip xmlns:r="http://schemas.openxmlformats.org/officeDocument/2006/relationships" r:embed="rIdLogoEphec"/>
+                    <a:blip r:embed="rId7" cstate="none"/>
+                    <a:srcRect/>
                     <a:stretch>
                       <a:fillRect/>
                     </a:stretch>
                   </pic:blipFill>
-                  <pic:spPr>
+                  <pic:spPr bwMode="auto">
                     <a:xfrm>
                       <a:off x="0" y="0"/>
                       <a:ext cx="1514475" cy="723900"/>
@@ -42,52 +48,88 @@
           </wp:inline>
         </w:drawing>
       </w:r>
-    </w:p>
-    <w:p>
-      <w:pPr>
-        <w:spacing w:after="100" w:before="500"/>
-        <w:jc w:val="center"/>
-      </w:pPr>
-      <w:r>
-        <w:rPr>
-          <w:color w:val="595959"/>
-          <w:sz w:val="24"/>
-          <w:szCs w:val="24"/>
-        </w:rPr>
-        <w:t xml:space="preserve">Démonstration du cours</w:t>
-      </w:r>
-    </w:p>
-    <w:p>
-      <w:pPr>
-        <w:spacing w:after="100"/>
-        <w:jc w:val="center"/>
-      </w:pPr>
-      <w:r>
-        <w:rPr>
+      <w:r>
+        <w:rPr>
+          <w:rFonts w:ascii="Calibri" w:cs="Calibri" w:eastAsia="Calibri" w:hAnsi="Calibri"/>
+          <w:sz w:val="36"/>
+          <w:szCs w:val="36"/>
+        </w:rPr>
+        <w:tab/>
+      </w:r>
+      <w:r>
+        <w:rPr>
+          <w:rFonts w:ascii="Calibri" w:cs="Calibri" w:eastAsia="Calibri" w:hAnsi="Calibri"/>
+          <w:color w:val="000000"/>
+          <w:sz w:val="36"/>
+          <w:szCs w:val="36"/>
+        </w:rPr>
+        <w:t xml:space="preserve">Année académique </w:t>
+      </w:r>
+      <w:r>
+        <w:rPr>
+          <w:rFonts w:ascii="Calibri" w:cs="Calibri" w:eastAsia="Calibri" w:hAnsi="Calibri"/>
           <w:b/>
           <w:bCs/>
-          <w:color w:val="1F4E79"/>
-          <w:sz w:val="52"/>
-          <w:szCs w:val="52"/>
-        </w:rPr>
-        <w:t xml:space="preserve">ABS</w:t>
-      </w:r>
-    </w:p>
-    <w:p>
-      <w:pPr>
-        <w:spacing w:after="300"/>
+          <w:color w:val="000000"/>
+          <w:sz w:val="36"/>
+          <w:szCs w:val="36"/>
+        </w:rPr>
+        <w:t xml:space="preserve">2026-2027</w:t>
+      </w:r>
+    </w:p>
+    <w:p>
+      <w:pPr>
+        <w:spacing w:after="120" w:before="3900"/>
         <w:jc w:val="center"/>
       </w:pPr>
       <w:r>
         <w:rPr>
+          <w:rFonts w:ascii="Calibri" w:cs="Calibri" w:eastAsia="Calibri" w:hAnsi="Calibri"/>
+          <w:color w:val="000000"/>
+          <w:sz w:val="36"/>
+          <w:szCs w:val="36"/>
+        </w:rPr>
+        <w:t xml:space="preserve">Démonstration du cours</w:t>
+      </w:r>
+    </w:p>
+    <w:p>
+      <w:pPr>
+        <w:spacing w:after="100" w:before="0"/>
+        <w:jc w:val="center"/>
+      </w:pPr>
+      <w:r>
+        <w:rPr>
+          <w:rFonts w:ascii="Calibri" w:cs="Calibri" w:eastAsia="Calibri" w:hAnsi="Calibri"/>
           <w:b/>
           <w:bCs/>
-          <w:color w:val="1F4E79"/>
-          <w:sz w:val="30"/>
-          <w:szCs w:val="30"/>
+          <w:color w:val="000000"/>
+          <w:sz w:val="72"/>
+          <w:szCs w:val="72"/>
+        </w:rPr>
+        <w:t xml:space="preserve">ABS</w:t>
+      </w:r>
+    </w:p>
+    <w:p>
+      <w:pPr>
+        <w:spacing w:after="200" w:before="0"/>
+        <w:jc w:val="center"/>
+      </w:pPr>
+      <w:r>
+        <w:rPr>
+          <w:rFonts w:ascii="Calibri" w:cs="Calibri" w:eastAsia="Calibri" w:hAnsi="Calibri"/>
+          <w:b/>
+          <w:bCs/>
+          <w:color w:val="000000"/>
+          <w:sz w:val="40"/>
+          <w:szCs w:val="40"/>
         </w:rPr>
         <w:t xml:space="preserve">Laisser l'outil supprimer la duplication</w:t>
       </w:r>
+    </w:p>
+    <w:p>
+      <w:pPr>
+        <w:spacing w:before="400"/>
+      </w:pPr>
     </w:p>
     <w:tbl>
       <w:tblPr>
@@ -266,44 +308,44 @@
     </w:tbl>
     <w:p>
       <w:pPr>
-        <w:spacing w:after="120"/>
-      </w:pPr>
-      <w:r>
-        <w:rPr>
-          <w:sz w:val="22"/>
-          <w:szCs w:val="22"/>
-        </w:rPr>
-        <w:t xml:space="preserve"/>
-      </w:r>
-    </w:p>
-    <w:p>
-      <w:pPr>
-        <w:spacing w:after="120"/>
+        <w:spacing w:after="120" w:before="300"/>
         <w:jc w:val="center"/>
       </w:pPr>
       <w:r>
         <w:rPr>
+          <w:rFonts w:ascii="Calibri" w:cs="Calibri" w:eastAsia="Calibri" w:hAnsi="Calibri"/>
           <w:i/>
           <w:iCs/>
-          <w:color w:val="595959"/>
-          <w:sz w:val="22"/>
-          <w:szCs w:val="22"/>
+          <w:color w:val="000000"/>
+          <w:sz w:val="28"/>
+          <w:szCs w:val="28"/>
         </w:rPr>
         <w:t xml:space="preserve">Document destiné au professeur — ne pas distribuer</w:t>
       </w:r>
     </w:p>
     <w:p>
       <w:pPr>
-        <w:sectPr>
-          <w:pgSz w:w="11906" w:h="16838" w:orient="portrait"/>
-          <w:pgMar w:top="1440" w:right="1440" w:bottom="1440" w:left="1440" w:header="708" w:footer="708" w:gutter="0"/>
-          <w:pgNumType/>
-          <w:docGrid w:linePitch="360"/>
-        </w:sectPr>
-      </w:pPr>
-    </w:p>
-    <w:p>
-      <w:pPr>
+        <w:spacing w:after="120" w:before="4000"/>
+        <w:jc w:val="center"/>
+      </w:pPr>
+      <w:r>
+        <w:rPr>
+          <w:rFonts w:ascii="Calibri" w:cs="Calibri" w:eastAsia="Calibri" w:hAnsi="Calibri"/>
+          <w:color w:val="000000"/>
+          <w:sz w:val="36"/>
+          <w:szCs w:val="36"/>
+        </w:rPr>
+        <w:t xml:space="preserve">EPHEC — Bachelier en informatique, niveau 2</w:t>
+      </w:r>
+    </w:p>
+    <w:p>
+      <w:r>
+        <w:br w:type="page"/>
+      </w:r>
+    </w:p>
+    <w:p>
+      <w:pPr>
+        <w:keepNext w:val="false"/>
         <w:spacing w:after="120"/>
       </w:pPr>
       <w:r>
@@ -350,6 +392,7 @@
     </w:p>
     <w:p>
       <w:pPr>
+        <w:keepNext w:val="false"/>
         <w:spacing w:after="120"/>
       </w:pPr>
       <w:r>
@@ -466,6 +509,7 @@
     </w:p>
     <w:p>
       <w:pPr>
+        <w:keepNext w:val="false"/>
         <w:spacing w:after="120"/>
       </w:pPr>
       <w:r>
@@ -1412,10 +1456,9 @@
       </w:r>
     </w:p>
     <w:sectPr>
-      <w:footerReference w:type="default" r:id="rId8"/>
       <w:pgSz w:w="11906" w:h="16838" w:orient="portrait"/>
       <w:pgMar w:top="1440" w:right="1440" w:bottom="1440" w:left="1440" w:header="708" w:footer="708" w:gutter="0"/>
-      <w:pgNumType w:start="1"/>
+      <w:pgNumType/>
       <w:docGrid w:linePitch="360"/>
     </w:sectPr>
   </w:body>
@@ -1461,67 +1504,6 @@
     </w:p>
   </w:endnote>
 </w:endnotes>
-</file>
-
-<file path=word/footer1.xml><?xml version="1.0" encoding="utf-8"?>
-<w:ftr xmlns:w="http://schemas.openxmlformats.org/wordprocessingml/2006/main">
-  <w:p>
-    <w:pPr>
-      <w:jc w:val="center"/>
-      <w:rPr>
-        <w:sz w:val="18"/>
-        <w:szCs w:val="18"/>
-        <w:color w:val="595959"/>
-      </w:rPr>
-    </w:pPr>
-    <w:r>
-      <w:rPr>
-        <w:sz w:val="18"/>
-        <w:szCs w:val="18"/>
-        <w:color w:val="595959"/>
-      </w:rPr>
-      <w:t xml:space="preserve">Demo_ABS </w:t>
-    </w:r>
-    <w:r>
-      <w:fldChar w:fldCharType="begin"/>
-    </w:r>
-    <w:r>
-      <w:instrText xml:space="preserve"> PAGE </w:instrText>
-    </w:r>
-    <w:r>
-      <w:fldChar w:fldCharType="separate"/>
-    </w:r>
-    <w:r>
-      <w:t>1</w:t>
-    </w:r>
-    <w:r>
-      <w:fldChar w:fldCharType="end"/>
-    </w:r>
-    <w:r>
-      <w:rPr>
-        <w:sz w:val="18"/>
-        <w:szCs w:val="18"/>
-        <w:color w:val="595959"/>
-      </w:rPr>
-      <w:t xml:space="preserve"> / </w:t>
-    </w:r>
-    <w:r>
-      <w:fldChar w:fldCharType="begin"/>
-    </w:r>
-    <w:r>
-      <w:instrText xml:space="preserve"> SECTIONPAGES </w:instrText>
-    </w:r>
-    <w:r>
-      <w:fldChar w:fldCharType="separate"/>
-    </w:r>
-    <w:r>
-      <w:t>2</w:t>
-    </w:r>
-    <w:r>
-      <w:fldChar w:fldCharType="end"/>
-    </w:r>
-  </w:p>
-</w:ftr>
 </file>
 
 <file path=word/footnotes.xml><?xml version="1.0" encoding="utf-8"?>

</xml_diff>